<commit_message>
finished spellbook class, started inventory
</commit_message>
<xml_diff>
--- a/cpp/hw/C++assignmentDescription.docx
+++ b/cpp/hw/C++assignmentDescription.docx
@@ -45,7 +45,7 @@
                       <a:picLocks noChangeAspect="1"/>
                       <a:extLst>
                         <a:ext uri="sm">
-                          <sm:smNativeData xmlns:sm="sm" xmlns:w="http://schemas.openxmlformats.org/wordprocessingml/2006/main" xmlns:w10="urn:schemas-microsoft-com:office:word" xmlns:v="urn:schemas-microsoft-com:vml" xmlns:o="urn:schemas-microsoft-com:office:office" xmlns="" val="SMDATA_16_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"/>
+                          <sm:smNativeData xmlns="" xmlns:o="urn:schemas-microsoft-com:office:office" xmlns:v="urn:schemas-microsoft-com:vml" xmlns:w10="urn:schemas-microsoft-com:office:word" xmlns:w="http://schemas.openxmlformats.org/wordprocessingml/2006/main" xmlns:sm="sm" val="SMDATA_16_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"/>
                         </a:ext>
                       </a:extLst>
                     </pic:cNvPicPr>
@@ -726,7 +726,6 @@
           <w:color w:val="000000"/>
         </w:rPr>
       </w:pPr>
-      <w:proofErr w:type="gramStart"/>
       <w:r>
         <w:rPr>
           <w:rStyle w:val="BuiltInTok"/>
@@ -734,17 +733,7 @@
           <w:color w:val="000000"/>
           <w:sz w:val="24"/>
         </w:rPr>
-        <w:t>b black</w:t>
-      </w:r>
-      <w:proofErr w:type="gramEnd"/>
-      <w:r>
-        <w:rPr>
-          <w:rStyle w:val="BuiltInTok"/>
-          <w:rFonts w:ascii="Verdana" w:eastAsia="Verdana" w:hAnsi="Verdana" w:cs="Verdana"/>
-          <w:color w:val="000000"/>
-          <w:sz w:val="24"/>
-        </w:rPr>
-        <w:t xml:space="preserve"> 189</w:t>
+        <w:t>b black 189</w:t>
       </w:r>
     </w:p>
     <w:p>
@@ -1433,6 +1422,7 @@
           <w:rFonts w:ascii="Times New Roman" w:eastAsia="Times New Roman" w:hAnsi="Times New Roman" w:cs="Times New Roman"/>
           <w:color w:val="000000"/>
           <w:sz w:val="24"/>
+          <w:highlight w:val="green"/>
         </w:rPr>
         <w:t>Book</w:t>
       </w:r>
@@ -1440,6 +1430,7 @@
         <w:rPr>
           <w:rFonts w:ascii="Times New Roman" w:eastAsia="Times New Roman" w:hAnsi="Times New Roman" w:cs="Times New Roman"/>
           <w:color w:val="000000"/>
+          <w:highlight w:val="green"/>
         </w:rPr>
         <w:t xml:space="preserve"> Class</w:t>
       </w:r>
@@ -1544,29 +1535,7 @@
           <w:sz w:val="20"/>
           <w:szCs w:val="20"/>
         </w:rPr>
-        <w:t xml:space="preserve">- </w:t>
-      </w:r>
-      <w:proofErr w:type="gramStart"/>
-      <w:r>
-        <w:rPr>
-          <w:rStyle w:val="VerbatimChar"/>
-          <w:rFonts w:ascii="Verdana" w:eastAsia="Verdana" w:hAnsi="Verdana" w:cs="Verdana"/>
-          <w:color w:val="000000"/>
-          <w:sz w:val="20"/>
-          <w:szCs w:val="20"/>
-        </w:rPr>
-        <w:t>Book(</w:t>
-      </w:r>
-      <w:proofErr w:type="gramEnd"/>
-      <w:r>
-        <w:rPr>
-          <w:rStyle w:val="VerbatimChar"/>
-          <w:rFonts w:ascii="Verdana" w:eastAsia="Verdana" w:hAnsi="Verdana" w:cs="Verdana"/>
-          <w:color w:val="000000"/>
-          <w:sz w:val="20"/>
-          <w:szCs w:val="20"/>
-        </w:rPr>
-        <w:t xml:space="preserve">) </w:t>
+        <w:t xml:space="preserve">- Book() </w:t>
       </w:r>
     </w:p>
     <w:p>
@@ -1668,7 +1637,7 @@
           <w:sz w:val="20"/>
           <w:szCs w:val="20"/>
         </w:rPr>
-        <w:t xml:space="preserve">- </w:t>
+        <w:t>- Book(</w:t>
       </w:r>
       <w:proofErr w:type="gramStart"/>
       <w:r>
@@ -1679,7 +1648,7 @@
           <w:sz w:val="20"/>
           <w:szCs w:val="20"/>
         </w:rPr>
-        <w:t>Book(std::</w:t>
+        <w:t>std::</w:t>
       </w:r>
       <w:proofErr w:type="gramEnd"/>
       <w:r>
@@ -1843,7 +1812,7 @@
           <w:sz w:val="20"/>
           <w:szCs w:val="20"/>
         </w:rPr>
-        <w:t xml:space="preserve">- </w:t>
+        <w:t>- Book(</w:t>
       </w:r>
       <w:proofErr w:type="gramStart"/>
       <w:r>
@@ -1854,7 +1823,7 @@
           <w:sz w:val="20"/>
           <w:szCs w:val="20"/>
         </w:rPr>
-        <w:t>Book(std::</w:t>
+        <w:t>std::</w:t>
       </w:r>
       <w:proofErr w:type="gramEnd"/>
       <w:r>
@@ -2010,29 +1979,7 @@
           <w:sz w:val="20"/>
           <w:szCs w:val="20"/>
         </w:rPr>
-        <w:t>~</w:t>
-      </w:r>
-      <w:proofErr w:type="gramStart"/>
-      <w:r>
-        <w:rPr>
-          <w:rStyle w:val="VerbatimChar"/>
-          <w:rFonts w:ascii="Verdana" w:eastAsia="Verdana" w:hAnsi="Verdana" w:cs="Verdana"/>
-          <w:color w:val="000000"/>
-          <w:sz w:val="20"/>
-          <w:szCs w:val="20"/>
-        </w:rPr>
-        <w:t>Book(</w:t>
-      </w:r>
-      <w:proofErr w:type="gramEnd"/>
-      <w:r>
-        <w:rPr>
-          <w:rStyle w:val="VerbatimChar"/>
-          <w:rFonts w:ascii="Verdana" w:eastAsia="Verdana" w:hAnsi="Verdana" w:cs="Verdana"/>
-          <w:color w:val="000000"/>
-          <w:sz w:val="20"/>
-          <w:szCs w:val="20"/>
-        </w:rPr>
-        <w:t>)</w:t>
+        <w:t>~Book()</w:t>
       </w:r>
       <w:r>
         <w:rPr>
@@ -2114,7 +2061,6 @@
         <w:t xml:space="preserve">string </w:t>
       </w:r>
       <w:proofErr w:type="spellStart"/>
-      <w:proofErr w:type="gramStart"/>
       <w:r>
         <w:rPr>
           <w:rStyle w:val="VerbatimChar"/>
@@ -2134,18 +2080,7 @@
           <w:sz w:val="20"/>
           <w:szCs w:val="20"/>
         </w:rPr>
-        <w:t>(</w:t>
-      </w:r>
-      <w:proofErr w:type="gramEnd"/>
-      <w:r>
-        <w:rPr>
-          <w:rStyle w:val="VerbatimChar"/>
-          <w:rFonts w:ascii="Verdana" w:eastAsia="Verdana" w:hAnsi="Verdana" w:cs="Verdana"/>
-          <w:color w:val="000000"/>
-          <w:sz w:val="20"/>
-          <w:szCs w:val="20"/>
-        </w:rPr>
-        <w:t>)</w:t>
+        <w:t>()</w:t>
       </w:r>
       <w:r>
         <w:rPr>
@@ -2176,7 +2111,6 @@
         <w:t xml:space="preserve">- double </w:t>
       </w:r>
       <w:proofErr w:type="spellStart"/>
-      <w:proofErr w:type="gramStart"/>
       <w:r>
         <w:rPr>
           <w:rStyle w:val="VerbatimChar"/>
@@ -2196,18 +2130,7 @@
           <w:sz w:val="20"/>
           <w:szCs w:val="20"/>
         </w:rPr>
-        <w:t>(</w:t>
-      </w:r>
-      <w:proofErr w:type="gramEnd"/>
-      <w:r>
-        <w:rPr>
-          <w:rStyle w:val="VerbatimChar"/>
-          <w:rFonts w:ascii="Verdana" w:eastAsia="Verdana" w:hAnsi="Verdana" w:cs="Verdana"/>
-          <w:color w:val="000000"/>
-          <w:sz w:val="20"/>
-          <w:szCs w:val="20"/>
-        </w:rPr>
-        <w:t>)</w:t>
+        <w:t>()</w:t>
       </w:r>
       <w:r>
         <w:rPr>
@@ -2238,7 +2161,6 @@
         <w:t xml:space="preserve">- void </w:t>
       </w:r>
       <w:proofErr w:type="spellStart"/>
-      <w:proofErr w:type="gramStart"/>
       <w:r>
         <w:rPr>
           <w:rStyle w:val="VerbatimChar"/>
@@ -2258,18 +2180,7 @@
           <w:sz w:val="20"/>
           <w:szCs w:val="20"/>
         </w:rPr>
-        <w:t>(</w:t>
-      </w:r>
-      <w:proofErr w:type="gramEnd"/>
-      <w:r>
-        <w:rPr>
-          <w:rStyle w:val="VerbatimChar"/>
-          <w:rFonts w:ascii="Verdana" w:eastAsia="Verdana" w:hAnsi="Verdana" w:cs="Verdana"/>
-          <w:color w:val="000000"/>
-          <w:sz w:val="20"/>
-          <w:szCs w:val="20"/>
-        </w:rPr>
-        <w:t xml:space="preserve">const </w:t>
+        <w:t xml:space="preserve">(const </w:t>
       </w:r>
       <w:proofErr w:type="gramStart"/>
       <w:r>
@@ -2392,7 +2303,6 @@
         <w:t xml:space="preserve">- double </w:t>
       </w:r>
       <w:proofErr w:type="spellStart"/>
-      <w:proofErr w:type="gramStart"/>
       <w:r>
         <w:rPr>
           <w:rStyle w:val="VerbatimChar"/>
@@ -2419,15 +2329,7 @@
           <w:rFonts w:ascii="Times New Roman" w:eastAsia="Times New Roman" w:hAnsi="Times New Roman" w:cs="Times New Roman"/>
           <w:color w:val="000000"/>
         </w:rPr>
-        <w:t>  /</w:t>
-      </w:r>
-      <w:proofErr w:type="gramEnd"/>
-      <w:r>
-        <w:rPr>
-          <w:rFonts w:ascii="Times New Roman" w:eastAsia="Times New Roman" w:hAnsi="Times New Roman" w:cs="Times New Roman"/>
-          <w:color w:val="000000"/>
-        </w:rPr>
-        <w:t xml:space="preserve">/ returns </w:t>
+        <w:t xml:space="preserve">  // returns </w:t>
       </w:r>
       <w:r>
         <w:rPr>
@@ -2479,29 +2381,7 @@
           <w:sz w:val="20"/>
           <w:szCs w:val="20"/>
         </w:rPr>
-        <w:t xml:space="preserve">string </w:t>
-      </w:r>
-      <w:proofErr w:type="gramStart"/>
-      <w:r>
-        <w:rPr>
-          <w:rStyle w:val="VerbatimChar"/>
-          <w:rFonts w:ascii="Verdana" w:eastAsia="Verdana" w:hAnsi="Verdana" w:cs="Verdana"/>
-          <w:color w:val="000000"/>
-          <w:sz w:val="20"/>
-          <w:szCs w:val="20"/>
-        </w:rPr>
-        <w:t>str(</w:t>
-      </w:r>
-      <w:proofErr w:type="gramEnd"/>
-      <w:r>
-        <w:rPr>
-          <w:rStyle w:val="VerbatimChar"/>
-          <w:rFonts w:ascii="Verdana" w:eastAsia="Verdana" w:hAnsi="Verdana" w:cs="Verdana"/>
-          <w:color w:val="000000"/>
-          <w:sz w:val="20"/>
-          <w:szCs w:val="20"/>
-        </w:rPr>
-        <w:t>)</w:t>
+        <w:t>string str()</w:t>
       </w:r>
       <w:r>
         <w:rPr>
@@ -2605,7 +2485,6 @@
         <w:t xml:space="preserve">Literature </w:t>
       </w:r>
       <w:proofErr w:type="spellStart"/>
-      <w:proofErr w:type="gramStart"/>
       <w:r>
         <w:rPr>
           <w:rStyle w:val="VerbatimChar"/>
@@ -2616,7 +2495,6 @@
         <w:t>Book:hamlet</w:t>
       </w:r>
       <w:proofErr w:type="spellEnd"/>
-      <w:proofErr w:type="gramEnd"/>
       <w:r>
         <w:rPr>
           <w:rStyle w:val="VerbatimChar"/>
@@ -2651,23 +2529,7 @@
           <w:rFonts w:ascii="Times New Roman" w:eastAsia="Times New Roman" w:hAnsi="Times New Roman" w:cs="Times New Roman"/>
           <w:color w:val="000000"/>
         </w:rPr>
-        <w:t xml:space="preserve"> No space after colon </w:t>
-      </w:r>
-      <w:proofErr w:type="gramStart"/>
-      <w:r>
-        <w:rPr>
-          <w:rFonts w:ascii="Times New Roman" w:eastAsia="Times New Roman" w:hAnsi="Times New Roman" w:cs="Times New Roman"/>
-          <w:color w:val="000000"/>
-        </w:rPr>
-        <w:t>( :</w:t>
-      </w:r>
-      <w:proofErr w:type="gramEnd"/>
-      <w:r>
-        <w:rPr>
-          <w:rFonts w:ascii="Times New Roman" w:eastAsia="Times New Roman" w:hAnsi="Times New Roman" w:cs="Times New Roman"/>
-          <w:color w:val="000000"/>
-        </w:rPr>
-        <w:t xml:space="preserve"> )</w:t>
+        <w:t xml:space="preserve"> No space after colon ( : )</w:t>
       </w:r>
     </w:p>
     <w:p>
@@ -2800,7 +2662,6 @@
         <w:t xml:space="preserve">- </w:t>
       </w:r>
       <w:proofErr w:type="spellStart"/>
-      <w:proofErr w:type="gramStart"/>
       <w:r>
         <w:rPr>
           <w:rStyle w:val="VerbatimChar"/>
@@ -2820,18 +2681,7 @@
           <w:sz w:val="20"/>
           <w:szCs w:val="20"/>
         </w:rPr>
-        <w:t>(</w:t>
-      </w:r>
-      <w:proofErr w:type="gramEnd"/>
-      <w:r>
-        <w:rPr>
-          <w:rStyle w:val="VerbatimChar"/>
-          <w:rFonts w:ascii="Verdana" w:eastAsia="Verdana" w:hAnsi="Verdana" w:cs="Verdana"/>
-          <w:color w:val="000000"/>
-          <w:sz w:val="20"/>
-          <w:szCs w:val="20"/>
-        </w:rPr>
-        <w:t>)</w:t>
+        <w:t>()</w:t>
       </w:r>
     </w:p>
     <w:p>
@@ -2903,6 +2753,27 @@
         <w:t xml:space="preserve">- </w:t>
       </w:r>
       <w:proofErr w:type="spellStart"/>
+      <w:r>
+        <w:rPr>
+          <w:rStyle w:val="VerbatimChar"/>
+          <w:rFonts w:ascii="Verdana" w:eastAsia="Verdana" w:hAnsi="Verdana" w:cs="Verdana"/>
+          <w:color w:val="000000"/>
+          <w:sz w:val="20"/>
+          <w:szCs w:val="20"/>
+        </w:rPr>
+        <w:t>SpellBook</w:t>
+      </w:r>
+      <w:proofErr w:type="spellEnd"/>
+      <w:r>
+        <w:rPr>
+          <w:rStyle w:val="VerbatimChar"/>
+          <w:rFonts w:ascii="Verdana" w:eastAsia="Verdana" w:hAnsi="Verdana" w:cs="Verdana"/>
+          <w:color w:val="000000"/>
+          <w:sz w:val="20"/>
+          <w:szCs w:val="20"/>
+        </w:rPr>
+        <w:t>(</w:t>
+      </w:r>
       <w:proofErr w:type="gramStart"/>
       <w:r>
         <w:rPr>
@@ -2912,7 +2783,29 @@
           <w:sz w:val="20"/>
           <w:szCs w:val="20"/>
         </w:rPr>
-        <w:t>SpellBook</w:t>
+        <w:t>std::</w:t>
+      </w:r>
+      <w:proofErr w:type="gramEnd"/>
+      <w:r>
+        <w:rPr>
+          <w:rStyle w:val="VerbatimChar"/>
+          <w:rFonts w:ascii="Verdana" w:eastAsia="Verdana" w:hAnsi="Verdana" w:cs="Verdana"/>
+          <w:color w:val="000000"/>
+          <w:sz w:val="20"/>
+          <w:szCs w:val="20"/>
+        </w:rPr>
+        <w:t xml:space="preserve">string </w:t>
+      </w:r>
+      <w:proofErr w:type="spellStart"/>
+      <w:r>
+        <w:rPr>
+          <w:rStyle w:val="VerbatimChar"/>
+          <w:rFonts w:ascii="Verdana" w:eastAsia="Verdana" w:hAnsi="Verdana" w:cs="Verdana"/>
+          <w:color w:val="000000"/>
+          <w:sz w:val="20"/>
+          <w:szCs w:val="20"/>
+        </w:rPr>
+        <w:t>gname</w:t>
       </w:r>
       <w:proofErr w:type="spellEnd"/>
       <w:r>
@@ -2923,18 +2816,7 @@
           <w:sz w:val="20"/>
           <w:szCs w:val="20"/>
         </w:rPr>
-        <w:t>(std::</w:t>
-      </w:r>
-      <w:proofErr w:type="gramEnd"/>
-      <w:r>
-        <w:rPr>
-          <w:rStyle w:val="VerbatimChar"/>
-          <w:rFonts w:ascii="Verdana" w:eastAsia="Verdana" w:hAnsi="Verdana" w:cs="Verdana"/>
-          <w:color w:val="000000"/>
-          <w:sz w:val="20"/>
-          <w:szCs w:val="20"/>
-        </w:rPr>
-        <w:t xml:space="preserve">string </w:t>
+        <w:t xml:space="preserve">, double </w:t>
       </w:r>
       <w:proofErr w:type="spellStart"/>
       <w:r>
@@ -2945,7 +2827,7 @@
           <w:sz w:val="20"/>
           <w:szCs w:val="20"/>
         </w:rPr>
-        <w:t>gname</w:t>
+        <w:t>gprice</w:t>
       </w:r>
       <w:proofErr w:type="spellEnd"/>
       <w:r>
@@ -2956,51 +2838,7 @@
           <w:sz w:val="20"/>
           <w:szCs w:val="20"/>
         </w:rPr>
-        <w:t xml:space="preserve">, double </w:t>
-      </w:r>
-      <w:proofErr w:type="spellStart"/>
-      <w:r>
-        <w:rPr>
-          <w:rStyle w:val="VerbatimChar"/>
-          <w:rFonts w:ascii="Verdana" w:eastAsia="Verdana" w:hAnsi="Verdana" w:cs="Verdana"/>
-          <w:color w:val="000000"/>
-          <w:sz w:val="20"/>
-          <w:szCs w:val="20"/>
-        </w:rPr>
-        <w:t>gprice</w:t>
-      </w:r>
-      <w:proofErr w:type="spellEnd"/>
-      <w:r>
-        <w:rPr>
-          <w:rStyle w:val="VerbatimChar"/>
-          <w:rFonts w:ascii="Verdana" w:eastAsia="Verdana" w:hAnsi="Verdana" w:cs="Verdana"/>
-          <w:color w:val="000000"/>
-          <w:sz w:val="20"/>
-          <w:szCs w:val="20"/>
-        </w:rPr>
-        <w:t xml:space="preserve">, </w:t>
-      </w:r>
-      <w:proofErr w:type="gramStart"/>
-      <w:r>
-        <w:rPr>
-          <w:rStyle w:val="VerbatimChar"/>
-          <w:rFonts w:ascii="Verdana" w:eastAsia="Verdana" w:hAnsi="Verdana" w:cs="Verdana"/>
-          <w:color w:val="000000"/>
-          <w:sz w:val="20"/>
-          <w:szCs w:val="20"/>
-        </w:rPr>
-        <w:t>bool</w:t>
-      </w:r>
-      <w:proofErr w:type="gramEnd"/>
-      <w:r>
-        <w:rPr>
-          <w:rStyle w:val="VerbatimChar"/>
-          <w:rFonts w:ascii="Verdana" w:eastAsia="Verdana" w:hAnsi="Verdana" w:cs="Verdana"/>
-          <w:color w:val="000000"/>
-          <w:sz w:val="20"/>
-          <w:szCs w:val="20"/>
-        </w:rPr>
-        <w:t xml:space="preserve"> </w:t>
+        <w:t xml:space="preserve">, bool </w:t>
       </w:r>
       <w:proofErr w:type="spellStart"/>
       <w:r>
@@ -3199,6 +3037,27 @@
         <w:t xml:space="preserve">- </w:t>
       </w:r>
       <w:proofErr w:type="spellStart"/>
+      <w:r>
+        <w:rPr>
+          <w:rStyle w:val="VerbatimChar"/>
+          <w:rFonts w:ascii="Verdana" w:eastAsia="Verdana" w:hAnsi="Verdana" w:cs="Verdana"/>
+          <w:color w:val="000000"/>
+          <w:sz w:val="20"/>
+          <w:szCs w:val="20"/>
+        </w:rPr>
+        <w:t>SpellBook</w:t>
+      </w:r>
+      <w:proofErr w:type="spellEnd"/>
+      <w:r>
+        <w:rPr>
+          <w:rStyle w:val="VerbatimChar"/>
+          <w:rFonts w:ascii="Verdana" w:eastAsia="Verdana" w:hAnsi="Verdana" w:cs="Verdana"/>
+          <w:color w:val="000000"/>
+          <w:sz w:val="20"/>
+          <w:szCs w:val="20"/>
+        </w:rPr>
+        <w:t>(</w:t>
+      </w:r>
       <w:proofErr w:type="gramStart"/>
       <w:r>
         <w:rPr>
@@ -3208,18 +3067,7 @@
           <w:sz w:val="20"/>
           <w:szCs w:val="20"/>
         </w:rPr>
-        <w:t>SpellBook</w:t>
-      </w:r>
-      <w:proofErr w:type="spellEnd"/>
-      <w:r>
-        <w:rPr>
-          <w:rStyle w:val="VerbatimChar"/>
-          <w:rFonts w:ascii="Verdana" w:eastAsia="Verdana" w:hAnsi="Verdana" w:cs="Verdana"/>
-          <w:color w:val="000000"/>
-          <w:sz w:val="20"/>
-          <w:szCs w:val="20"/>
-        </w:rPr>
-        <w:t>(std::</w:t>
+        <w:t>std::</w:t>
       </w:r>
       <w:proofErr w:type="gramEnd"/>
       <w:r>
@@ -3423,7 +3271,6 @@
         <w:t>~</w:t>
       </w:r>
       <w:proofErr w:type="spellStart"/>
-      <w:proofErr w:type="gramStart"/>
       <w:r>
         <w:rPr>
           <w:rStyle w:val="VerbatimChar"/>
@@ -3443,18 +3290,7 @@
           <w:sz w:val="20"/>
           <w:szCs w:val="20"/>
         </w:rPr>
-        <w:t>(</w:t>
-      </w:r>
-      <w:proofErr w:type="gramEnd"/>
-      <w:r>
-        <w:rPr>
-          <w:rStyle w:val="VerbatimChar"/>
-          <w:rFonts w:ascii="Verdana" w:eastAsia="Verdana" w:hAnsi="Verdana" w:cs="Verdana"/>
-          <w:color w:val="000000"/>
-          <w:sz w:val="20"/>
-          <w:szCs w:val="20"/>
-        </w:rPr>
-        <w:t>)</w:t>
+        <w:t>()</w:t>
       </w:r>
       <w:r>
         <w:rPr>
@@ -3513,32 +3349,9 @@
           <w:sz w:val="20"/>
           <w:szCs w:val="20"/>
         </w:rPr>
-        <w:t xml:space="preserve">- </w:t>
-      </w:r>
-      <w:proofErr w:type="gramStart"/>
-      <w:r>
-        <w:rPr>
-          <w:rStyle w:val="VerbatimChar"/>
-          <w:rFonts w:ascii="Verdana" w:eastAsia="Verdana" w:hAnsi="Verdana" w:cs="Verdana"/>
-          <w:color w:val="000000"/>
-          <w:sz w:val="20"/>
-          <w:szCs w:val="20"/>
-        </w:rPr>
-        <w:t>bool</w:t>
-      </w:r>
-      <w:proofErr w:type="gramEnd"/>
-      <w:r>
-        <w:rPr>
-          <w:rStyle w:val="VerbatimChar"/>
-          <w:rFonts w:ascii="Verdana" w:eastAsia="Verdana" w:hAnsi="Verdana" w:cs="Verdana"/>
-          <w:color w:val="000000"/>
-          <w:sz w:val="20"/>
-          <w:szCs w:val="20"/>
-        </w:rPr>
-        <w:t xml:space="preserve"> </w:t>
+        <w:t xml:space="preserve">- bool </w:t>
       </w:r>
       <w:proofErr w:type="spellStart"/>
-      <w:proofErr w:type="gramStart"/>
       <w:r>
         <w:rPr>
           <w:rStyle w:val="VerbatimChar"/>
@@ -3558,18 +3371,7 @@
           <w:sz w:val="20"/>
           <w:szCs w:val="20"/>
         </w:rPr>
-        <w:t>(</w:t>
-      </w:r>
-      <w:proofErr w:type="gramEnd"/>
-      <w:r>
-        <w:rPr>
-          <w:rStyle w:val="VerbatimChar"/>
-          <w:rFonts w:ascii="Verdana" w:eastAsia="Verdana" w:hAnsi="Verdana" w:cs="Verdana"/>
-          <w:color w:val="000000"/>
-          <w:sz w:val="20"/>
-          <w:szCs w:val="20"/>
-        </w:rPr>
-        <w:t>)</w:t>
+        <w:t>()</w:t>
       </w:r>
       <w:r>
         <w:rPr>
@@ -3649,6 +3451,109 @@
         <w:t xml:space="preserve">- double </w:t>
       </w:r>
       <w:proofErr w:type="spellStart"/>
+      <w:r>
+        <w:rPr>
+          <w:rStyle w:val="VerbatimChar"/>
+          <w:rFonts w:ascii="Verdana" w:eastAsia="Verdana" w:hAnsi="Verdana" w:cs="Verdana"/>
+          <w:color w:val="000000"/>
+          <w:sz w:val="20"/>
+          <w:szCs w:val="20"/>
+        </w:rPr>
+        <w:t>getRealPrice</w:t>
+      </w:r>
+      <w:proofErr w:type="spellEnd"/>
+      <w:r>
+        <w:rPr>
+          <w:rStyle w:val="VerbatimChar"/>
+          <w:rFonts w:ascii="Verdana" w:eastAsia="Verdana" w:hAnsi="Verdana" w:cs="Verdana"/>
+          <w:color w:val="000000"/>
+          <w:sz w:val="20"/>
+          <w:szCs w:val="20"/>
+        </w:rPr>
+        <w:t>()</w:t>
+      </w:r>
+    </w:p>
+    <w:p>
+      <w:pPr>
+        <w:pStyle w:val="Compact"/>
+        <w:spacing w:before="0" w:after="0"/>
+        <w:ind w:left="720"/>
+        <w:rPr>
+          <w:rFonts w:ascii="Times New Roman" w:eastAsia="Times New Roman" w:hAnsi="Times New Roman" w:cs="Times New Roman"/>
+          <w:color w:val="000000"/>
+        </w:rPr>
+      </w:pPr>
+      <w:r>
+        <w:rPr>
+          <w:rFonts w:ascii="Times New Roman" w:eastAsia="Times New Roman" w:hAnsi="Times New Roman" w:cs="Times New Roman"/>
+          <w:color w:val="000000"/>
+        </w:rPr>
+        <w:t xml:space="preserve">returns </w:t>
+      </w:r>
+      <w:r>
+        <w:rPr>
+          <w:rStyle w:val="VerbatimChar"/>
+          <w:rFonts w:ascii="Times New Roman" w:eastAsia="Times New Roman" w:hAnsi="Times New Roman" w:cs="Times New Roman"/>
+          <w:color w:val="000000"/>
+          <w:sz w:val="24"/>
+        </w:rPr>
+        <w:t>price * 1.1</w:t>
+      </w:r>
+      <w:r>
+        <w:rPr>
+          <w:rFonts w:ascii="Times New Roman" w:eastAsia="Times New Roman" w:hAnsi="Times New Roman" w:cs="Times New Roman"/>
+          <w:color w:val="000000"/>
+        </w:rPr>
+        <w:t xml:space="preserve"> if </w:t>
+      </w:r>
+      <w:proofErr w:type="spellStart"/>
+      <w:r>
+        <w:rPr>
+          <w:rStyle w:val="VerbatimChar"/>
+          <w:rFonts w:ascii="Times New Roman" w:eastAsia="Times New Roman" w:hAnsi="Times New Roman" w:cs="Times New Roman"/>
+          <w:color w:val="000000"/>
+          <w:sz w:val="24"/>
+        </w:rPr>
+        <w:t>canTalk</w:t>
+      </w:r>
+      <w:proofErr w:type="spellEnd"/>
+      <w:r>
+        <w:rPr>
+          <w:rFonts w:ascii="Times New Roman" w:eastAsia="Times New Roman" w:hAnsi="Times New Roman" w:cs="Times New Roman"/>
+          <w:color w:val="000000"/>
+        </w:rPr>
+        <w:t xml:space="preserve"> is true, otherwise </w:t>
+      </w:r>
+      <w:r>
+        <w:rPr>
+          <w:rStyle w:val="VerbatimChar"/>
+          <w:rFonts w:ascii="Times New Roman" w:eastAsia="Times New Roman" w:hAnsi="Times New Roman" w:cs="Times New Roman"/>
+          <w:color w:val="000000"/>
+          <w:sz w:val="24"/>
+        </w:rPr>
+        <w:t>price</w:t>
+      </w:r>
+    </w:p>
+    <w:p>
+      <w:pPr>
+        <w:pStyle w:val="Compact"/>
+        <w:spacing w:before="0" w:after="0"/>
+        <w:ind w:firstLine="720"/>
+        <w:rPr>
+          <w:rFonts w:ascii="Times New Roman" w:eastAsia="Times New Roman" w:hAnsi="Times New Roman" w:cs="Times New Roman"/>
+          <w:color w:val="000000"/>
+        </w:rPr>
+      </w:pPr>
+      <w:r>
+        <w:rPr>
+          <w:rStyle w:val="VerbatimChar"/>
+          <w:rFonts w:ascii="Verdana" w:eastAsia="Verdana" w:hAnsi="Verdana" w:cs="Verdana"/>
+          <w:color w:val="000000"/>
+          <w:sz w:val="20"/>
+          <w:szCs w:val="20"/>
+        </w:rPr>
+        <w:t xml:space="preserve">- </w:t>
+      </w:r>
       <w:proofErr w:type="gramStart"/>
       <w:r>
         <w:rPr>
@@ -3658,18 +3563,7 @@
           <w:sz w:val="20"/>
           <w:szCs w:val="20"/>
         </w:rPr>
-        <w:t>getRealPrice</w:t>
-      </w:r>
-      <w:proofErr w:type="spellEnd"/>
-      <w:r>
-        <w:rPr>
-          <w:rStyle w:val="VerbatimChar"/>
-          <w:rFonts w:ascii="Verdana" w:eastAsia="Verdana" w:hAnsi="Verdana" w:cs="Verdana"/>
-          <w:color w:val="000000"/>
-          <w:sz w:val="20"/>
-          <w:szCs w:val="20"/>
-        </w:rPr>
-        <w:t>(</w:t>
+        <w:t>std::</w:t>
       </w:r>
       <w:proofErr w:type="gramEnd"/>
       <w:r>
@@ -3680,133 +3574,7 @@
           <w:sz w:val="20"/>
           <w:szCs w:val="20"/>
         </w:rPr>
-        <w:t>)</w:t>
-      </w:r>
-    </w:p>
-    <w:p>
-      <w:pPr>
-        <w:pStyle w:val="Compact"/>
-        <w:spacing w:before="0" w:after="0"/>
-        <w:ind w:left="720"/>
-        <w:rPr>
-          <w:rFonts w:ascii="Times New Roman" w:eastAsia="Times New Roman" w:hAnsi="Times New Roman" w:cs="Times New Roman"/>
-          <w:color w:val="000000"/>
-        </w:rPr>
-      </w:pPr>
-      <w:r>
-        <w:rPr>
-          <w:rFonts w:ascii="Times New Roman" w:eastAsia="Times New Roman" w:hAnsi="Times New Roman" w:cs="Times New Roman"/>
-          <w:color w:val="000000"/>
-        </w:rPr>
-        <w:t xml:space="preserve">returns </w:t>
-      </w:r>
-      <w:r>
-        <w:rPr>
-          <w:rStyle w:val="VerbatimChar"/>
-          <w:rFonts w:ascii="Times New Roman" w:eastAsia="Times New Roman" w:hAnsi="Times New Roman" w:cs="Times New Roman"/>
-          <w:color w:val="000000"/>
-          <w:sz w:val="24"/>
-        </w:rPr>
-        <w:t>price * 1.1</w:t>
-      </w:r>
-      <w:r>
-        <w:rPr>
-          <w:rFonts w:ascii="Times New Roman" w:eastAsia="Times New Roman" w:hAnsi="Times New Roman" w:cs="Times New Roman"/>
-          <w:color w:val="000000"/>
-        </w:rPr>
-        <w:t xml:space="preserve"> if </w:t>
-      </w:r>
-      <w:proofErr w:type="spellStart"/>
-      <w:r>
-        <w:rPr>
-          <w:rStyle w:val="VerbatimChar"/>
-          <w:rFonts w:ascii="Times New Roman" w:eastAsia="Times New Roman" w:hAnsi="Times New Roman" w:cs="Times New Roman"/>
-          <w:color w:val="000000"/>
-          <w:sz w:val="24"/>
-        </w:rPr>
-        <w:t>canTalk</w:t>
-      </w:r>
-      <w:proofErr w:type="spellEnd"/>
-      <w:r>
-        <w:rPr>
-          <w:rFonts w:ascii="Times New Roman" w:eastAsia="Times New Roman" w:hAnsi="Times New Roman" w:cs="Times New Roman"/>
-          <w:color w:val="000000"/>
-        </w:rPr>
-        <w:t xml:space="preserve"> is true, otherwise </w:t>
-      </w:r>
-      <w:r>
-        <w:rPr>
-          <w:rStyle w:val="VerbatimChar"/>
-          <w:rFonts w:ascii="Times New Roman" w:eastAsia="Times New Roman" w:hAnsi="Times New Roman" w:cs="Times New Roman"/>
-          <w:color w:val="000000"/>
-          <w:sz w:val="24"/>
-        </w:rPr>
-        <w:t>price</w:t>
-      </w:r>
-    </w:p>
-    <w:p>
-      <w:pPr>
-        <w:pStyle w:val="Compact"/>
-        <w:spacing w:before="0" w:after="0"/>
-        <w:ind w:firstLine="720"/>
-        <w:rPr>
-          <w:rFonts w:ascii="Times New Roman" w:eastAsia="Times New Roman" w:hAnsi="Times New Roman" w:cs="Times New Roman"/>
-          <w:color w:val="000000"/>
-        </w:rPr>
-      </w:pPr>
-      <w:r>
-        <w:rPr>
-          <w:rStyle w:val="VerbatimChar"/>
-          <w:rFonts w:ascii="Verdana" w:eastAsia="Verdana" w:hAnsi="Verdana" w:cs="Verdana"/>
-          <w:color w:val="000000"/>
-          <w:sz w:val="20"/>
-          <w:szCs w:val="20"/>
-        </w:rPr>
-        <w:t xml:space="preserve">- </w:t>
-      </w:r>
-      <w:proofErr w:type="gramStart"/>
-      <w:r>
-        <w:rPr>
-          <w:rStyle w:val="VerbatimChar"/>
-          <w:rFonts w:ascii="Verdana" w:eastAsia="Verdana" w:hAnsi="Verdana" w:cs="Verdana"/>
-          <w:color w:val="000000"/>
-          <w:sz w:val="20"/>
-          <w:szCs w:val="20"/>
-        </w:rPr>
-        <w:t>std::</w:t>
-      </w:r>
-      <w:proofErr w:type="gramEnd"/>
-      <w:r>
-        <w:rPr>
-          <w:rStyle w:val="VerbatimChar"/>
-          <w:rFonts w:ascii="Verdana" w:eastAsia="Verdana" w:hAnsi="Verdana" w:cs="Verdana"/>
-          <w:color w:val="000000"/>
-          <w:sz w:val="20"/>
-          <w:szCs w:val="20"/>
-        </w:rPr>
-        <w:t xml:space="preserve">string </w:t>
-      </w:r>
-      <w:proofErr w:type="gramStart"/>
-      <w:r>
-        <w:rPr>
-          <w:rStyle w:val="VerbatimChar"/>
-          <w:rFonts w:ascii="Verdana" w:eastAsia="Verdana" w:hAnsi="Verdana" w:cs="Verdana"/>
-          <w:color w:val="000000"/>
-          <w:sz w:val="20"/>
-          <w:szCs w:val="20"/>
-        </w:rPr>
-        <w:t>str(</w:t>
-      </w:r>
-      <w:proofErr w:type="gramEnd"/>
-      <w:r>
-        <w:rPr>
-          <w:rStyle w:val="VerbatimChar"/>
-          <w:rFonts w:ascii="Verdana" w:eastAsia="Verdana" w:hAnsi="Verdana" w:cs="Verdana"/>
-          <w:color w:val="000000"/>
-          <w:sz w:val="20"/>
-          <w:szCs w:val="20"/>
-        </w:rPr>
-        <w:t>)</w:t>
+        <w:t>string str()</w:t>
       </w:r>
     </w:p>
     <w:p>
@@ -3832,27 +3600,7 @@
           <w:color w:val="000000"/>
           <w:sz w:val="24"/>
         </w:rPr>
-        <w:t>"Spell Book:&lt;name</w:t>
-      </w:r>
-      <w:proofErr w:type="gramStart"/>
-      <w:r>
-        <w:rPr>
-          <w:rStyle w:val="VerbatimChar"/>
-          <w:rFonts w:ascii="Times New Roman" w:eastAsia="Times New Roman" w:hAnsi="Times New Roman" w:cs="Times New Roman"/>
-          <w:color w:val="000000"/>
-          <w:sz w:val="24"/>
-        </w:rPr>
-        <w:t>&gt;  price</w:t>
-      </w:r>
-      <w:proofErr w:type="gramEnd"/>
-      <w:r>
-        <w:rPr>
-          <w:rStyle w:val="VerbatimChar"/>
-          <w:rFonts w:ascii="Times New Roman" w:eastAsia="Times New Roman" w:hAnsi="Times New Roman" w:cs="Times New Roman"/>
-          <w:color w:val="000000"/>
-          <w:sz w:val="24"/>
-        </w:rPr>
-        <w:t>:&lt;</w:t>
+        <w:t>"Spell Book:&lt;name&gt;  price:&lt;</w:t>
       </w:r>
       <w:proofErr w:type="spellStart"/>
       <w:r>
@@ -3906,27 +3654,7 @@
           <w:color w:val="000000"/>
           <w:sz w:val="24"/>
         </w:rPr>
-        <w:t>"Speaking Book:&lt;name</w:t>
-      </w:r>
-      <w:proofErr w:type="gramStart"/>
-      <w:r>
-        <w:rPr>
-          <w:rStyle w:val="VerbatimChar"/>
-          <w:rFonts w:ascii="Times New Roman" w:eastAsia="Times New Roman" w:hAnsi="Times New Roman" w:cs="Times New Roman"/>
-          <w:color w:val="000000"/>
-          <w:sz w:val="24"/>
-        </w:rPr>
-        <w:t>&gt;  price</w:t>
-      </w:r>
-      <w:proofErr w:type="gramEnd"/>
-      <w:r>
-        <w:rPr>
-          <w:rStyle w:val="VerbatimChar"/>
-          <w:rFonts w:ascii="Times New Roman" w:eastAsia="Times New Roman" w:hAnsi="Times New Roman" w:cs="Times New Roman"/>
-          <w:color w:val="000000"/>
-          <w:sz w:val="24"/>
-        </w:rPr>
-        <w:t>:&lt;</w:t>
+        <w:t>"Speaking Book:&lt;name&gt;  price:&lt;</w:t>
       </w:r>
       <w:proofErr w:type="spellStart"/>
       <w:r>
@@ -3989,7 +3717,6 @@
         <w:t xml:space="preserve">Speaking </w:t>
       </w:r>
       <w:proofErr w:type="spellStart"/>
-      <w:proofErr w:type="gramStart"/>
       <w:r>
         <w:rPr>
           <w:rStyle w:val="VerbatimChar"/>
@@ -4000,7 +3727,6 @@
         <w:t>Book:necronomicon</w:t>
       </w:r>
       <w:proofErr w:type="spellEnd"/>
-      <w:proofErr w:type="gramEnd"/>
       <w:r>
         <w:rPr>
           <w:rStyle w:val="VerbatimChar"/>
@@ -4031,7 +3757,6 @@
         <w:t xml:space="preserve">Spell </w:t>
       </w:r>
       <w:proofErr w:type="spellStart"/>
-      <w:proofErr w:type="gramStart"/>
       <w:r>
         <w:rPr>
           <w:rStyle w:val="VerbatimChar"/>
@@ -4042,7 +3767,6 @@
         <w:t>Book:NinethGate</w:t>
       </w:r>
       <w:proofErr w:type="spellEnd"/>
-      <w:proofErr w:type="gramEnd"/>
       <w:r>
         <w:rPr>
           <w:rStyle w:val="VerbatimChar"/>
@@ -4171,6 +3895,16 @@
           <w:color w:val="000000"/>
         </w:rPr>
       </w:pPr>
+      <w:r>
+        <w:rPr>
+          <w:rStyle w:val="VerbatimChar"/>
+          <w:rFonts w:ascii="Verdana" w:eastAsia="Verdana" w:hAnsi="Verdana" w:cs="Verdana"/>
+          <w:color w:val="000000"/>
+          <w:sz w:val="20"/>
+          <w:szCs w:val="20"/>
+        </w:rPr>
+        <w:t>Inventory(</w:t>
+      </w:r>
       <w:proofErr w:type="gramStart"/>
       <w:r>
         <w:rPr>
@@ -4180,7 +3914,7 @@
           <w:sz w:val="20"/>
           <w:szCs w:val="20"/>
         </w:rPr>
-        <w:t>Inventory(std::</w:t>
+        <w:t>std::</w:t>
       </w:r>
       <w:proofErr w:type="gramEnd"/>
       <w:r>
@@ -4310,29 +4044,7 @@
           <w:sz w:val="20"/>
           <w:szCs w:val="20"/>
         </w:rPr>
-        <w:t>~</w:t>
-      </w:r>
-      <w:proofErr w:type="gramStart"/>
-      <w:r>
-        <w:rPr>
-          <w:rStyle w:val="VerbatimChar"/>
-          <w:rFonts w:ascii="Verdana" w:eastAsia="Verdana" w:hAnsi="Verdana" w:cs="Verdana"/>
-          <w:color w:val="000000"/>
-          <w:sz w:val="20"/>
-          <w:szCs w:val="20"/>
-        </w:rPr>
-        <w:t>Inventory(</w:t>
-      </w:r>
-      <w:proofErr w:type="gramEnd"/>
-      <w:r>
-        <w:rPr>
-          <w:rStyle w:val="VerbatimChar"/>
-          <w:rFonts w:ascii="Verdana" w:eastAsia="Verdana" w:hAnsi="Verdana" w:cs="Verdana"/>
-          <w:color w:val="000000"/>
-          <w:sz w:val="20"/>
-          <w:szCs w:val="20"/>
-        </w:rPr>
-        <w:t>)</w:t>
+        <w:t>~Inventory()</w:t>
       </w:r>
       <w:r>
         <w:rPr>
@@ -4394,6 +4106,27 @@
         <w:t xml:space="preserve">- void </w:t>
       </w:r>
       <w:proofErr w:type="spellStart"/>
+      <w:r>
+        <w:rPr>
+          <w:rStyle w:val="VerbatimChar"/>
+          <w:rFonts w:ascii="Verdana" w:eastAsia="Verdana" w:hAnsi="Verdana" w:cs="Verdana"/>
+          <w:color w:val="000000"/>
+          <w:sz w:val="20"/>
+          <w:szCs w:val="20"/>
+        </w:rPr>
+        <w:t>readData</w:t>
+      </w:r>
+      <w:proofErr w:type="spellEnd"/>
+      <w:r>
+        <w:rPr>
+          <w:rStyle w:val="VerbatimChar"/>
+          <w:rFonts w:ascii="Verdana" w:eastAsia="Verdana" w:hAnsi="Verdana" w:cs="Verdana"/>
+          <w:color w:val="000000"/>
+          <w:sz w:val="20"/>
+          <w:szCs w:val="20"/>
+        </w:rPr>
+        <w:t>(</w:t>
+      </w:r>
       <w:proofErr w:type="gramStart"/>
       <w:r>
         <w:rPr>
@@ -4403,7 +4136,29 @@
           <w:sz w:val="20"/>
           <w:szCs w:val="20"/>
         </w:rPr>
-        <w:t>readData</w:t>
+        <w:t>std::</w:t>
+      </w:r>
+      <w:proofErr w:type="gramEnd"/>
+      <w:r>
+        <w:rPr>
+          <w:rStyle w:val="VerbatimChar"/>
+          <w:rFonts w:ascii="Verdana" w:eastAsia="Verdana" w:hAnsi="Verdana" w:cs="Verdana"/>
+          <w:color w:val="000000"/>
+          <w:sz w:val="20"/>
+          <w:szCs w:val="20"/>
+        </w:rPr>
+        <w:t xml:space="preserve">string </w:t>
+      </w:r>
+      <w:proofErr w:type="spellStart"/>
+      <w:r>
+        <w:rPr>
+          <w:rStyle w:val="VerbatimChar"/>
+          <w:rFonts w:ascii="Verdana" w:eastAsia="Verdana" w:hAnsi="Verdana" w:cs="Verdana"/>
+          <w:color w:val="000000"/>
+          <w:sz w:val="20"/>
+          <w:szCs w:val="20"/>
+        </w:rPr>
+        <w:t>fname</w:t>
       </w:r>
       <w:proofErr w:type="spellEnd"/>
       <w:r>
@@ -4414,40 +4169,79 @@
           <w:sz w:val="20"/>
           <w:szCs w:val="20"/>
         </w:rPr>
-        <w:t>(std::</w:t>
-      </w:r>
-      <w:proofErr w:type="gramEnd"/>
-      <w:r>
-        <w:rPr>
-          <w:rStyle w:val="VerbatimChar"/>
-          <w:rFonts w:ascii="Verdana" w:eastAsia="Verdana" w:hAnsi="Verdana" w:cs="Verdana"/>
-          <w:color w:val="000000"/>
-          <w:sz w:val="20"/>
-          <w:szCs w:val="20"/>
-        </w:rPr>
-        <w:t xml:space="preserve">string </w:t>
+        <w:t>)</w:t>
+      </w:r>
+    </w:p>
+    <w:p>
+      <w:pPr>
+        <w:pStyle w:val="Compact"/>
+        <w:spacing w:before="0" w:after="0"/>
+        <w:ind w:left="720"/>
+        <w:rPr>
+          <w:rFonts w:ascii="Times New Roman" w:eastAsia="Times New Roman" w:hAnsi="Times New Roman" w:cs="Times New Roman"/>
+          <w:color w:val="000000"/>
+        </w:rPr>
+      </w:pPr>
+      <w:r>
+        <w:rPr>
+          <w:rFonts w:ascii="Times New Roman" w:eastAsia="Times New Roman" w:hAnsi="Times New Roman" w:cs="Times New Roman"/>
+          <w:color w:val="000000"/>
+        </w:rPr>
+        <w:t xml:space="preserve">opens </w:t>
       </w:r>
       <w:proofErr w:type="spellStart"/>
       <w:r>
         <w:rPr>
           <w:rStyle w:val="VerbatimChar"/>
-          <w:rFonts w:ascii="Verdana" w:eastAsia="Verdana" w:hAnsi="Verdana" w:cs="Verdana"/>
-          <w:color w:val="000000"/>
-          <w:sz w:val="20"/>
-          <w:szCs w:val="20"/>
+          <w:rFonts w:ascii="Times New Roman" w:eastAsia="Times New Roman" w:hAnsi="Times New Roman" w:cs="Times New Roman"/>
+          <w:color w:val="000000"/>
+          <w:sz w:val="24"/>
         </w:rPr>
         <w:t>fname</w:t>
       </w:r>
       <w:proofErr w:type="spellEnd"/>
       <w:r>
         <w:rPr>
-          <w:rStyle w:val="VerbatimChar"/>
-          <w:rFonts w:ascii="Verdana" w:eastAsia="Verdana" w:hAnsi="Verdana" w:cs="Verdana"/>
-          <w:color w:val="000000"/>
-          <w:sz w:val="20"/>
-          <w:szCs w:val="20"/>
-        </w:rPr>
-        <w:t>)</w:t>
+          <w:rFonts w:ascii="Times New Roman" w:eastAsia="Times New Roman" w:hAnsi="Times New Roman" w:cs="Times New Roman"/>
+          <w:color w:val="000000"/>
+        </w:rPr>
+        <w:t xml:space="preserve">; on failure prints </w:t>
+      </w:r>
+      <w:r>
+        <w:rPr>
+          <w:rStyle w:val="VerbatimChar"/>
+          <w:rFonts w:ascii="Times New Roman" w:eastAsia="Times New Roman" w:hAnsi="Times New Roman" w:cs="Times New Roman"/>
+          <w:color w:val="000000"/>
+          <w:sz w:val="24"/>
+        </w:rPr>
+        <w:t>Error opening file {</w:t>
+      </w:r>
+      <w:proofErr w:type="spellStart"/>
+      <w:r>
+        <w:rPr>
+          <w:rStyle w:val="VerbatimChar"/>
+          <w:rFonts w:ascii="Times New Roman" w:eastAsia="Times New Roman" w:hAnsi="Times New Roman" w:cs="Times New Roman"/>
+          <w:color w:val="000000"/>
+          <w:sz w:val="24"/>
+        </w:rPr>
+        <w:t>fname</w:t>
+      </w:r>
+      <w:proofErr w:type="spellEnd"/>
+      <w:r>
+        <w:rPr>
+          <w:rStyle w:val="VerbatimChar"/>
+          <w:rFonts w:ascii="Times New Roman" w:eastAsia="Times New Roman" w:hAnsi="Times New Roman" w:cs="Times New Roman"/>
+          <w:color w:val="000000"/>
+          <w:sz w:val="24"/>
+        </w:rPr>
+        <w:t>}</w:t>
+      </w:r>
+      <w:r>
+        <w:rPr>
+          <w:rFonts w:ascii="Times New Roman" w:eastAsia="Times New Roman" w:hAnsi="Times New Roman" w:cs="Times New Roman"/>
+          <w:color w:val="000000"/>
+        </w:rPr>
+        <w:t xml:space="preserve"> and returns</w:t>
       </w:r>
     </w:p>
     <w:p>
@@ -4465,99 +4259,16 @@
           <w:rFonts w:ascii="Times New Roman" w:eastAsia="Times New Roman" w:hAnsi="Times New Roman" w:cs="Times New Roman"/>
           <w:color w:val="000000"/>
         </w:rPr>
-        <w:t xml:space="preserve">opens </w:t>
-      </w:r>
-      <w:proofErr w:type="spellStart"/>
-      <w:r>
-        <w:rPr>
-          <w:rStyle w:val="VerbatimChar"/>
-          <w:rFonts w:ascii="Times New Roman" w:eastAsia="Times New Roman" w:hAnsi="Times New Roman" w:cs="Times New Roman"/>
-          <w:color w:val="000000"/>
-          <w:sz w:val="24"/>
-        </w:rPr>
-        <w:t>fname</w:t>
-      </w:r>
-      <w:proofErr w:type="spellEnd"/>
-      <w:r>
-        <w:rPr>
-          <w:rFonts w:ascii="Times New Roman" w:eastAsia="Times New Roman" w:hAnsi="Times New Roman" w:cs="Times New Roman"/>
-          <w:color w:val="000000"/>
-        </w:rPr>
-        <w:t xml:space="preserve">; on failure prints </w:t>
-      </w:r>
-      <w:r>
-        <w:rPr>
-          <w:rStyle w:val="VerbatimChar"/>
-          <w:rFonts w:ascii="Times New Roman" w:eastAsia="Times New Roman" w:hAnsi="Times New Roman" w:cs="Times New Roman"/>
-          <w:color w:val="000000"/>
-          <w:sz w:val="24"/>
-        </w:rPr>
-        <w:t>Error opening file {</w:t>
-      </w:r>
-      <w:proofErr w:type="spellStart"/>
-      <w:r>
-        <w:rPr>
-          <w:rStyle w:val="VerbatimChar"/>
-          <w:rFonts w:ascii="Times New Roman" w:eastAsia="Times New Roman" w:hAnsi="Times New Roman" w:cs="Times New Roman"/>
-          <w:color w:val="000000"/>
-          <w:sz w:val="24"/>
-        </w:rPr>
-        <w:t>fname</w:t>
-      </w:r>
-      <w:proofErr w:type="spellEnd"/>
-      <w:r>
-        <w:rPr>
-          <w:rStyle w:val="VerbatimChar"/>
-          <w:rFonts w:ascii="Times New Roman" w:eastAsia="Times New Roman" w:hAnsi="Times New Roman" w:cs="Times New Roman"/>
-          <w:color w:val="000000"/>
-          <w:sz w:val="24"/>
-        </w:rPr>
-        <w:t>}</w:t>
-      </w:r>
-      <w:r>
-        <w:rPr>
-          <w:rFonts w:ascii="Times New Roman" w:eastAsia="Times New Roman" w:hAnsi="Times New Roman" w:cs="Times New Roman"/>
-          <w:color w:val="000000"/>
-        </w:rPr>
-        <w:t xml:space="preserve"> and returns</w:t>
-      </w:r>
-    </w:p>
-    <w:p>
-      <w:pPr>
-        <w:pStyle w:val="Compact"/>
-        <w:spacing w:before="0" w:after="0"/>
-        <w:ind w:left="720"/>
-        <w:rPr>
-          <w:rFonts w:ascii="Times New Roman" w:eastAsia="Times New Roman" w:hAnsi="Times New Roman" w:cs="Times New Roman"/>
-          <w:color w:val="000000"/>
-        </w:rPr>
-      </w:pPr>
-      <w:r>
-        <w:rPr>
-          <w:rFonts w:ascii="Times New Roman" w:eastAsia="Times New Roman" w:hAnsi="Times New Roman" w:cs="Times New Roman"/>
-          <w:color w:val="000000"/>
-        </w:rPr>
         <w:t xml:space="preserve">Otherwise, reads each line, uses </w:t>
       </w:r>
-      <w:proofErr w:type="gramStart"/>
-      <w:r>
-        <w:rPr>
-          <w:rStyle w:val="VerbatimChar"/>
-          <w:rFonts w:ascii="Times New Roman" w:eastAsia="Times New Roman" w:hAnsi="Times New Roman" w:cs="Times New Roman"/>
-          <w:color w:val="000000"/>
-          <w:sz w:val="24"/>
-        </w:rPr>
-        <w:t>line[</w:t>
-      </w:r>
-      <w:proofErr w:type="gramEnd"/>
-      <w:r>
-        <w:rPr>
-          <w:rStyle w:val="VerbatimChar"/>
-          <w:rFonts w:ascii="Times New Roman" w:eastAsia="Times New Roman" w:hAnsi="Times New Roman" w:cs="Times New Roman"/>
-          <w:color w:val="000000"/>
-          <w:sz w:val="24"/>
-        </w:rPr>
-        <w:t>0]</w:t>
+      <w:r>
+        <w:rPr>
+          <w:rStyle w:val="VerbatimChar"/>
+          <w:rFonts w:ascii="Times New Roman" w:eastAsia="Times New Roman" w:hAnsi="Times New Roman" w:cs="Times New Roman"/>
+          <w:color w:val="000000"/>
+          <w:sz w:val="24"/>
+        </w:rPr>
+        <w:t>line[0]</w:t>
       </w:r>
       <w:r>
         <w:rPr>
@@ -4630,7 +4341,7 @@
           <w:sz w:val="20"/>
           <w:szCs w:val="20"/>
         </w:rPr>
-        <w:t xml:space="preserve">- void </w:t>
+        <w:t>- void add(</w:t>
       </w:r>
       <w:proofErr w:type="gramStart"/>
       <w:r>
@@ -4641,7 +4352,7 @@
           <w:sz w:val="20"/>
           <w:szCs w:val="20"/>
         </w:rPr>
-        <w:t>add(std::</w:t>
+        <w:t>std::</w:t>
       </w:r>
       <w:proofErr w:type="spellStart"/>
       <w:proofErr w:type="gramEnd"/>
@@ -4734,7 +4445,6 @@
         <w:t xml:space="preserve">- bool </w:t>
       </w:r>
       <w:proofErr w:type="spellStart"/>
-      <w:proofErr w:type="gramStart"/>
       <w:r>
         <w:rPr>
           <w:rStyle w:val="VerbatimChar"/>
@@ -4754,18 +4464,7 @@
           <w:sz w:val="20"/>
           <w:szCs w:val="20"/>
         </w:rPr>
-        <w:t>(</w:t>
-      </w:r>
-      <w:proofErr w:type="gramEnd"/>
-      <w:r>
-        <w:rPr>
-          <w:rStyle w:val="VerbatimChar"/>
-          <w:rFonts w:ascii="Verdana" w:eastAsia="Verdana" w:hAnsi="Verdana" w:cs="Verdana"/>
-          <w:color w:val="000000"/>
-          <w:sz w:val="20"/>
-          <w:szCs w:val="20"/>
-        </w:rPr>
-        <w:t>)</w:t>
+        <w:t>()</w:t>
       </w:r>
     </w:p>
     <w:p>
@@ -4858,29 +4557,7 @@
           <w:sz w:val="20"/>
           <w:szCs w:val="20"/>
         </w:rPr>
-        <w:t xml:space="preserve">string </w:t>
-      </w:r>
-      <w:proofErr w:type="gramStart"/>
-      <w:r>
-        <w:rPr>
-          <w:rStyle w:val="VerbatimChar"/>
-          <w:rFonts w:ascii="Verdana" w:eastAsia="Verdana" w:hAnsi="Verdana" w:cs="Verdana"/>
-          <w:color w:val="000000"/>
-          <w:sz w:val="20"/>
-          <w:szCs w:val="20"/>
-        </w:rPr>
-        <w:t>str(</w:t>
-      </w:r>
-      <w:proofErr w:type="gramEnd"/>
-      <w:r>
-        <w:rPr>
-          <w:rStyle w:val="VerbatimChar"/>
-          <w:rFonts w:ascii="Verdana" w:eastAsia="Verdana" w:hAnsi="Verdana" w:cs="Verdana"/>
-          <w:color w:val="000000"/>
-          <w:sz w:val="20"/>
-          <w:szCs w:val="20"/>
-        </w:rPr>
-        <w:t xml:space="preserve">) </w:t>
+        <w:t xml:space="preserve">string str() </w:t>
       </w:r>
     </w:p>
     <w:p>
@@ -4899,48 +4576,21 @@
         </w:rPr>
         <w:t xml:space="preserve">Returns each Book element's </w:t>
       </w:r>
-      <w:proofErr w:type="gramStart"/>
-      <w:r>
-        <w:rPr>
-          <w:rStyle w:val="VerbatimChar"/>
-          <w:rFonts w:ascii="Times New Roman" w:eastAsia="Times New Roman" w:hAnsi="Times New Roman" w:cs="Times New Roman"/>
-          <w:color w:val="000000"/>
-          <w:sz w:val="24"/>
-        </w:rPr>
-        <w:t>str(</w:t>
-      </w:r>
-      <w:proofErr w:type="gramEnd"/>
-      <w:r>
-        <w:rPr>
-          <w:rStyle w:val="VerbatimChar"/>
-          <w:rFonts w:ascii="Times New Roman" w:eastAsia="Times New Roman" w:hAnsi="Times New Roman" w:cs="Times New Roman"/>
-          <w:color w:val="000000"/>
-          <w:sz w:val="24"/>
-        </w:rPr>
-        <w:t>)</w:t>
-      </w:r>
-      <w:r>
-        <w:rPr>
-          <w:rFonts w:ascii="Times New Roman" w:eastAsia="Times New Roman" w:hAnsi="Times New Roman" w:cs="Times New Roman"/>
-          <w:color w:val="000000"/>
-        </w:rPr>
-        <w:t xml:space="preserve"> joined with newlines. You will use polymorphism here to call the overridden </w:t>
-      </w:r>
-      <w:proofErr w:type="gramStart"/>
-      <w:r>
-        <w:rPr>
-          <w:rFonts w:ascii="Times New Roman" w:eastAsia="Times New Roman" w:hAnsi="Times New Roman" w:cs="Times New Roman"/>
-          <w:color w:val="000000"/>
-        </w:rPr>
-        <w:t>str(</w:t>
-      </w:r>
-      <w:proofErr w:type="gramEnd"/>
-      <w:r>
-        <w:rPr>
-          <w:rFonts w:ascii="Times New Roman" w:eastAsia="Times New Roman" w:hAnsi="Times New Roman" w:cs="Times New Roman"/>
-          <w:color w:val="000000"/>
-        </w:rPr>
-        <w:t>) method.</w:t>
+      <w:r>
+        <w:rPr>
+          <w:rStyle w:val="VerbatimChar"/>
+          <w:rFonts w:ascii="Times New Roman" w:eastAsia="Times New Roman" w:hAnsi="Times New Roman" w:cs="Times New Roman"/>
+          <w:color w:val="000000"/>
+          <w:sz w:val="24"/>
+        </w:rPr>
+        <w:t>str()</w:t>
+      </w:r>
+      <w:r>
+        <w:rPr>
+          <w:rFonts w:ascii="Times New Roman" w:eastAsia="Times New Roman" w:hAnsi="Times New Roman" w:cs="Times New Roman"/>
+          <w:color w:val="000000"/>
+        </w:rPr>
+        <w:t xml:space="preserve"> joined with newlines. You will use polymorphism here to call the overridden str() method.</w:t>
       </w:r>
     </w:p>
     <w:p>
@@ -4968,7 +4618,6 @@
         <w:t xml:space="preserve">- double </w:t>
       </w:r>
       <w:proofErr w:type="spellStart"/>
-      <w:proofErr w:type="gramStart"/>
       <w:r>
         <w:rPr>
           <w:rStyle w:val="VerbatimChar"/>
@@ -4988,18 +4637,7 @@
           <w:sz w:val="20"/>
           <w:szCs w:val="20"/>
         </w:rPr>
-        <w:t>(</w:t>
-      </w:r>
-      <w:proofErr w:type="gramEnd"/>
-      <w:r>
-        <w:rPr>
-          <w:rStyle w:val="VerbatimChar"/>
-          <w:rFonts w:ascii="Verdana" w:eastAsia="Verdana" w:hAnsi="Verdana" w:cs="Verdana"/>
-          <w:color w:val="000000"/>
-          <w:sz w:val="20"/>
-          <w:szCs w:val="20"/>
-        </w:rPr>
-        <w:t>)</w:t>
+        <w:t>()</w:t>
       </w:r>
       <w:r>
         <w:rPr>
@@ -5030,7 +4668,6 @@
         <w:t xml:space="preserve">sums </w:t>
       </w:r>
       <w:proofErr w:type="spellStart"/>
-      <w:proofErr w:type="gramStart"/>
       <w:r>
         <w:rPr>
           <w:rStyle w:val="VerbatimChar"/>
@@ -5048,17 +4685,7 @@
           <w:color w:val="000000"/>
           <w:sz w:val="24"/>
         </w:rPr>
-        <w:t>(</w:t>
-      </w:r>
-      <w:proofErr w:type="gramEnd"/>
-      <w:r>
-        <w:rPr>
-          <w:rStyle w:val="VerbatimChar"/>
-          <w:rFonts w:ascii="Times New Roman" w:eastAsia="Times New Roman" w:hAnsi="Times New Roman" w:cs="Times New Roman"/>
-          <w:color w:val="000000"/>
-          <w:sz w:val="24"/>
-        </w:rPr>
-        <w:t>)</w:t>
+        <w:t>()</w:t>
       </w:r>
       <w:r>
         <w:rPr>
@@ -5102,6 +4729,27 @@
         <w:t xml:space="preserve">- void </w:t>
       </w:r>
       <w:proofErr w:type="spellStart"/>
+      <w:r>
+        <w:rPr>
+          <w:rStyle w:val="VerbatimChar"/>
+          <w:rFonts w:ascii="Verdana" w:eastAsia="Verdana" w:hAnsi="Verdana" w:cs="Verdana"/>
+          <w:color w:val="000000"/>
+          <w:sz w:val="20"/>
+          <w:szCs w:val="20"/>
+        </w:rPr>
+        <w:t>searchBook</w:t>
+      </w:r>
+      <w:proofErr w:type="spellEnd"/>
+      <w:r>
+        <w:rPr>
+          <w:rStyle w:val="VerbatimChar"/>
+          <w:rFonts w:ascii="Verdana" w:eastAsia="Verdana" w:hAnsi="Verdana" w:cs="Verdana"/>
+          <w:color w:val="000000"/>
+          <w:sz w:val="20"/>
+          <w:szCs w:val="20"/>
+        </w:rPr>
+        <w:t>(</w:t>
+      </w:r>
       <w:proofErr w:type="gramStart"/>
       <w:r>
         <w:rPr>
@@ -5111,18 +4759,7 @@
           <w:sz w:val="20"/>
           <w:szCs w:val="20"/>
         </w:rPr>
-        <w:t>searchBook</w:t>
-      </w:r>
-      <w:proofErr w:type="spellEnd"/>
-      <w:r>
-        <w:rPr>
-          <w:rStyle w:val="VerbatimChar"/>
-          <w:rFonts w:ascii="Verdana" w:eastAsia="Verdana" w:hAnsi="Verdana" w:cs="Verdana"/>
-          <w:color w:val="000000"/>
-          <w:sz w:val="20"/>
-          <w:szCs w:val="20"/>
-        </w:rPr>
-        <w:t>(std::</w:t>
+        <w:t>std::</w:t>
       </w:r>
       <w:proofErr w:type="gramEnd"/>
       <w:r>
@@ -5183,25 +4820,14 @@
         </w:rPr>
         <w:t xml:space="preserve">prints matching Book object/s by calling </w:t>
       </w:r>
-      <w:proofErr w:type="gramStart"/>
-      <w:r>
-        <w:rPr>
-          <w:rStyle w:val="VerbatimChar"/>
-          <w:rFonts w:ascii="Times New Roman" w:eastAsia="Times New Roman" w:hAnsi="Times New Roman" w:cs="Times New Roman"/>
-          <w:color w:val="000000"/>
-          <w:sz w:val="24"/>
-        </w:rPr>
-        <w:t>str(</w:t>
-      </w:r>
-      <w:proofErr w:type="gramEnd"/>
-      <w:r>
-        <w:rPr>
-          <w:rStyle w:val="VerbatimChar"/>
-          <w:rFonts w:ascii="Times New Roman" w:eastAsia="Times New Roman" w:hAnsi="Times New Roman" w:cs="Times New Roman"/>
-          <w:color w:val="000000"/>
-          <w:sz w:val="24"/>
-        </w:rPr>
-        <w:t>)</w:t>
+      <w:r>
+        <w:rPr>
+          <w:rStyle w:val="VerbatimChar"/>
+          <w:rFonts w:ascii="Times New Roman" w:eastAsia="Times New Roman" w:hAnsi="Times New Roman" w:cs="Times New Roman"/>
+          <w:color w:val="000000"/>
+          <w:sz w:val="24"/>
+        </w:rPr>
+        <w:t>str()</w:t>
       </w:r>
       <w:r>
         <w:rPr>
@@ -5263,29 +4889,7 @@
           <w:sz w:val="20"/>
           <w:szCs w:val="20"/>
         </w:rPr>
-        <w:t xml:space="preserve">- void </w:t>
-      </w:r>
-      <w:proofErr w:type="gramStart"/>
-      <w:r>
-        <w:rPr>
-          <w:rStyle w:val="VerbatimChar"/>
-          <w:rFonts w:ascii="Verdana" w:eastAsia="Verdana" w:hAnsi="Verdana" w:cs="Verdana"/>
-          <w:color w:val="000000"/>
-          <w:sz w:val="20"/>
-          <w:szCs w:val="20"/>
-        </w:rPr>
-        <w:t>menu(</w:t>
-      </w:r>
-      <w:proofErr w:type="gramEnd"/>
-      <w:r>
-        <w:rPr>
-          <w:rStyle w:val="VerbatimChar"/>
-          <w:rFonts w:ascii="Verdana" w:eastAsia="Verdana" w:hAnsi="Verdana" w:cs="Verdana"/>
-          <w:color w:val="000000"/>
-          <w:sz w:val="20"/>
-          <w:szCs w:val="20"/>
-        </w:rPr>
-        <w:t>)</w:t>
+        <w:t>- void menu()</w:t>
       </w:r>
     </w:p>
     <w:p>
@@ -5305,7 +4909,6 @@
         <w:t xml:space="preserve">If </w:t>
       </w:r>
       <w:proofErr w:type="spellStart"/>
-      <w:proofErr w:type="gramStart"/>
       <w:r>
         <w:rPr>
           <w:rStyle w:val="VerbatimChar"/>
@@ -5325,18 +4928,7 @@
           <w:sz w:val="20"/>
           <w:szCs w:val="20"/>
         </w:rPr>
-        <w:t>(</w:t>
-      </w:r>
-      <w:proofErr w:type="gramEnd"/>
-      <w:r>
-        <w:rPr>
-          <w:rStyle w:val="VerbatimChar"/>
-          <w:rFonts w:ascii="Verdana" w:eastAsia="Verdana" w:hAnsi="Verdana" w:cs="Verdana"/>
-          <w:color w:val="000000"/>
-          <w:sz w:val="20"/>
-          <w:szCs w:val="20"/>
-        </w:rPr>
-        <w:t xml:space="preserve">) </w:t>
+        <w:t xml:space="preserve">() </w:t>
       </w:r>
       <w:r>
         <w:rPr>
@@ -5468,25 +5060,14 @@
         </w:rPr>
         <w:t xml:space="preserve"> → prints </w:t>
       </w:r>
-      <w:proofErr w:type="gramStart"/>
-      <w:r>
-        <w:rPr>
-          <w:rStyle w:val="VerbatimChar"/>
-          <w:rFonts w:ascii="Times New Roman" w:eastAsia="Times New Roman" w:hAnsi="Times New Roman" w:cs="Times New Roman"/>
-          <w:color w:val="000000"/>
-          <w:sz w:val="24"/>
-        </w:rPr>
-        <w:t>str(</w:t>
-      </w:r>
-      <w:proofErr w:type="gramEnd"/>
-      <w:r>
-        <w:rPr>
-          <w:rStyle w:val="VerbatimChar"/>
-          <w:rFonts w:ascii="Times New Roman" w:eastAsia="Times New Roman" w:hAnsi="Times New Roman" w:cs="Times New Roman"/>
-          <w:color w:val="000000"/>
-          <w:sz w:val="24"/>
-        </w:rPr>
-        <w:t>)</w:t>
+      <w:r>
+        <w:rPr>
+          <w:rStyle w:val="VerbatimChar"/>
+          <w:rFonts w:ascii="Times New Roman" w:eastAsia="Times New Roman" w:hAnsi="Times New Roman" w:cs="Times New Roman"/>
+          <w:color w:val="000000"/>
+          <w:sz w:val="24"/>
+        </w:rPr>
+        <w:t>str()</w:t>
       </w:r>
     </w:p>
     <w:p>
@@ -5516,7 +5097,6 @@
         <w:t xml:space="preserve"> → prints total from </w:t>
       </w:r>
       <w:proofErr w:type="spellStart"/>
-      <w:proofErr w:type="gramStart"/>
       <w:r>
         <w:rPr>
           <w:rStyle w:val="VerbatimChar"/>
@@ -5534,17 +5114,7 @@
           <w:color w:val="000000"/>
           <w:sz w:val="24"/>
         </w:rPr>
-        <w:t>(</w:t>
-      </w:r>
-      <w:proofErr w:type="gramEnd"/>
-      <w:r>
-        <w:rPr>
-          <w:rStyle w:val="VerbatimChar"/>
-          <w:rFonts w:ascii="Times New Roman" w:eastAsia="Times New Roman" w:hAnsi="Times New Roman" w:cs="Times New Roman"/>
-          <w:color w:val="000000"/>
-          <w:sz w:val="24"/>
-        </w:rPr>
-        <w:t>)</w:t>
+        <w:t>()</w:t>
       </w:r>
     </w:p>
     <w:p>
@@ -6061,7 +5631,6 @@
         <w:t xml:space="preserve">Spell </w:t>
       </w:r>
       <w:proofErr w:type="spellStart"/>
-      <w:proofErr w:type="gramStart"/>
       <w:r>
         <w:rPr>
           <w:rFonts w:ascii="Verdana" w:eastAsia="Verdana" w:hAnsi="Verdana" w:cs="Verdana"/>
@@ -6072,7 +5641,6 @@
         <w:t>Book:NinethGate</w:t>
       </w:r>
       <w:proofErr w:type="spellEnd"/>
-      <w:proofErr w:type="gramEnd"/>
       <w:r>
         <w:rPr>
           <w:rFonts w:ascii="Verdana" w:eastAsia="Verdana" w:hAnsi="Verdana" w:cs="Verdana"/>
@@ -6129,7 +5697,6 @@
           <w:szCs w:val="22"/>
         </w:rPr>
       </w:pPr>
-      <w:proofErr w:type="gramStart"/>
       <w:r>
         <w:rPr>
           <w:rFonts w:ascii="Verdana" w:eastAsia="Verdana" w:hAnsi="Verdana" w:cs="Verdana"/>
@@ -6141,7 +5708,6 @@
         </w:rPr>
         <w:t>all</w:t>
       </w:r>
-      <w:proofErr w:type="gramEnd"/>
     </w:p>
     <w:p>
       <w:pPr>
@@ -6185,7 +5751,6 @@
         <w:t xml:space="preserve">Literature </w:t>
       </w:r>
       <w:proofErr w:type="spellStart"/>
-      <w:proofErr w:type="gramStart"/>
       <w:r>
         <w:rPr>
           <w:rFonts w:ascii="Verdana" w:eastAsia="Verdana" w:hAnsi="Verdana" w:cs="Verdana"/>
@@ -6196,7 +5761,6 @@
         <w:t>Book:hamlet</w:t>
       </w:r>
       <w:proofErr w:type="spellEnd"/>
-      <w:proofErr w:type="gramEnd"/>
       <w:r>
         <w:rPr>
           <w:rFonts w:ascii="Verdana" w:eastAsia="Verdana" w:hAnsi="Verdana" w:cs="Verdana"/>
@@ -6228,7 +5792,6 @@
         <w:t xml:space="preserve">Speaking </w:t>
       </w:r>
       <w:proofErr w:type="spellStart"/>
-      <w:proofErr w:type="gramStart"/>
       <w:r>
         <w:rPr>
           <w:rFonts w:ascii="Verdana" w:eastAsia="Verdana" w:hAnsi="Verdana" w:cs="Verdana"/>
@@ -6239,7 +5802,6 @@
         <w:t>Book:necronomicon</w:t>
       </w:r>
       <w:proofErr w:type="spellEnd"/>
-      <w:proofErr w:type="gramEnd"/>
       <w:r>
         <w:rPr>
           <w:rFonts w:ascii="Verdana" w:eastAsia="Verdana" w:hAnsi="Verdana" w:cs="Verdana"/>
@@ -6271,7 +5833,6 @@
         <w:t xml:space="preserve">Literature </w:t>
       </w:r>
       <w:proofErr w:type="spellStart"/>
-      <w:proofErr w:type="gramStart"/>
       <w:r>
         <w:rPr>
           <w:rFonts w:ascii="Verdana" w:eastAsia="Verdana" w:hAnsi="Verdana" w:cs="Verdana"/>
@@ -6282,7 +5843,6 @@
         <w:t>Book:black</w:t>
       </w:r>
       <w:proofErr w:type="spellEnd"/>
-      <w:proofErr w:type="gramEnd"/>
       <w:r>
         <w:rPr>
           <w:rFonts w:ascii="Verdana" w:eastAsia="Verdana" w:hAnsi="Verdana" w:cs="Verdana"/>
@@ -6314,7 +5874,6 @@
         <w:t xml:space="preserve">Literature </w:t>
       </w:r>
       <w:proofErr w:type="spellStart"/>
-      <w:proofErr w:type="gramStart"/>
       <w:r>
         <w:rPr>
           <w:rFonts w:ascii="Verdana" w:eastAsia="Verdana" w:hAnsi="Verdana" w:cs="Verdana"/>
@@ -6325,7 +5884,6 @@
         <w:t>Book:othello</w:t>
       </w:r>
       <w:proofErr w:type="spellEnd"/>
-      <w:proofErr w:type="gramEnd"/>
       <w:r>
         <w:rPr>
           <w:rFonts w:ascii="Verdana" w:eastAsia="Verdana" w:hAnsi="Verdana" w:cs="Verdana"/>
@@ -6357,7 +5915,6 @@
         <w:t xml:space="preserve">Spell </w:t>
       </w:r>
       <w:proofErr w:type="spellStart"/>
-      <w:proofErr w:type="gramStart"/>
       <w:r>
         <w:rPr>
           <w:rFonts w:ascii="Verdana" w:eastAsia="Verdana" w:hAnsi="Verdana" w:cs="Verdana"/>
@@ -6368,7 +5925,6 @@
         <w:t>Book:NinethGate</w:t>
       </w:r>
       <w:proofErr w:type="spellEnd"/>
-      <w:proofErr w:type="gramEnd"/>
       <w:r>
         <w:rPr>
           <w:rFonts w:ascii="Verdana" w:eastAsia="Verdana" w:hAnsi="Verdana" w:cs="Verdana"/>
@@ -7167,23 +6723,7 @@
           <w:rFonts w:ascii="Times New Roman" w:eastAsia="Times New Roman" w:hAnsi="Times New Roman" w:cs="Times New Roman"/>
           <w:color w:val="000000"/>
         </w:rPr>
-        <w:t>, prints the Total price of the book</w:t>
-      </w:r>
-      <w:proofErr w:type="gramStart"/>
-      <w:r>
-        <w:rPr>
-          <w:rFonts w:ascii="Times New Roman" w:eastAsia="Times New Roman" w:hAnsi="Times New Roman" w:cs="Times New Roman"/>
-          <w:color w:val="000000"/>
-        </w:rPr>
-        <w:t>) :</w:t>
-      </w:r>
-      <w:proofErr w:type="gramEnd"/>
-      <w:r>
-        <w:rPr>
-          <w:rFonts w:ascii="Times New Roman" w:eastAsia="Times New Roman" w:hAnsi="Times New Roman" w:cs="Times New Roman"/>
-          <w:color w:val="000000"/>
-        </w:rPr>
-        <w:t xml:space="preserve"> 10 pts</w:t>
+        <w:t>, prints the Total price of the book) : 10 pts</w:t>
       </w:r>
     </w:p>
     <w:p>
@@ -7346,23 +6886,7 @@
           <w:rFonts w:ascii="Times New Roman" w:eastAsia="Times New Roman" w:hAnsi="Times New Roman" w:cs="Times New Roman"/>
           <w:color w:val="000000"/>
         </w:rPr>
-        <w:t xml:space="preserve">Functional header </w:t>
-      </w:r>
-      <w:proofErr w:type="gramStart"/>
-      <w:r>
-        <w:rPr>
-          <w:rFonts w:ascii="Times New Roman" w:eastAsia="Times New Roman" w:hAnsi="Times New Roman" w:cs="Times New Roman"/>
-          <w:color w:val="000000"/>
-        </w:rPr>
-        <w:t>comments(</w:t>
-      </w:r>
-      <w:proofErr w:type="gramEnd"/>
-      <w:r>
-        <w:rPr>
-          <w:rFonts w:ascii="Times New Roman" w:eastAsia="Times New Roman" w:hAnsi="Times New Roman" w:cs="Times New Roman"/>
-          <w:color w:val="000000"/>
-        </w:rPr>
-        <w:t>10 pts)</w:t>
+        <w:t>Functional header comments(10 pts)</w:t>
       </w:r>
     </w:p>
     <w:p>
@@ -7480,15 +7004,7 @@
           <w:rFonts w:ascii="Times New Roman" w:eastAsia="Times New Roman" w:hAnsi="Times New Roman" w:cs="Times New Roman"/>
           <w:color w:val="000000"/>
         </w:rPr>
-        <w:t>Book.</w:t>
-      </w:r>
-      <w:proofErr w:type="gramStart"/>
-      <w:r>
-        <w:rPr>
-          <w:rFonts w:ascii="Times New Roman" w:eastAsia="Times New Roman" w:hAnsi="Times New Roman" w:cs="Times New Roman"/>
-          <w:color w:val="000000"/>
-        </w:rPr>
-        <w:t>h</w:t>
+        <w:t>Book.h</w:t>
       </w:r>
       <w:proofErr w:type="spellEnd"/>
       <w:r>
@@ -7499,7 +7015,6 @@
         <w:t>/.</w:t>
       </w:r>
       <w:proofErr w:type="spellStart"/>
-      <w:proofErr w:type="gramEnd"/>
       <w:r>
         <w:rPr>
           <w:rFonts w:ascii="Times New Roman" w:eastAsia="Times New Roman" w:hAnsi="Times New Roman" w:cs="Times New Roman"/>

</xml_diff>